<commit_message>
docs(portfolio): apresentação Google Slides (.pptx) + 100% PNTP (Selo Diamante) + e-mail comercial
- Apresentacao-Portal-Prefeitura.pptx: deck 16:9 (14 slides) pronto p/ importar no Google Apresentações
- gerar_slides_pptx.py: gerador do deck (reaproveita os gráficos de assets/)
- Atualiza PNTP para 100% dos critérios / Selo Diamante (gráfico, HTML e .docx)
- Troca o contato para comercial@lideratecnologia.com.br em todo o material
- Logo branco da Lidera nos slides escuros (capa/encerramento); README com passo a passo do import
</commit_message>
<xml_diff>
--- a/portfolio/Portfolio-Portal-Prefeitura.docx
+++ b/portfolio/Portfolio-Portal-Prefeitura.docx
@@ -158,7 +158,7 @@
           <w:color w:val="556677"/>
           <w:sz w:val="19"/>
         </w:rPr>
-        <w:t>www.lideratecnologia.com.br   ·   lideraabrange@gmail.com</w:t>
+        <w:t>www.lideratecnologia.com.br   ·   comercial@lideratecnologia.com.br</w:t>
       </w:r>
     </w:p>
     <w:p>
@@ -681,7 +681,7 @@
               <w:rPr>
                 <w:sz w:val="19"/>
               </w:rPr>
-              <w:t>Conformidade PNTP/Atricon — caminho para o selo Diamante</w:t>
+              <w:t>Conformidade PNTP/Atricon — 100% dos critérios atendidos (Selo Diamante)</w:t>
             </w:r>
           </w:p>
           <w:p>
@@ -1400,7 +1400,7 @@
                 <w:b w:val="0"/>
                 <w:sz w:val="19"/>
               </w:rPr>
-              <w:t>Estrutura e dados alinhados à matriz de avaliação, rumo ao selo Diamante</w:t>
+              <w:t>100% dos critérios aplicáveis atendidos — Selo Diamante</w:t>
             </w:r>
           </w:p>
         </w:tc>
@@ -1445,7 +1445,7 @@
         <w:pStyle w:val="Heading1"/>
       </w:pPr>
       <w:r>
-        <w:t>Transparência e PNTP — rumo ao selo Diamante</w:t>
+        <w:t>Transparência e PNTP — 100% dos critérios (Selo Diamante)</w:t>
       </w:r>
     </w:p>
     <w:p>
@@ -1458,7 +1458,21 @@
           <w:i w:val="0"/>
           <w:sz w:val="21"/>
         </w:rPr>
-        <w:t>O Programa Nacional de Transparência Pública (Atricon) avalia o portal por uma matriz de critérios ponderados. Nossa arquitetura de transparência foi desenhada para pontuar nos itens de maior peso — Receita, Despesa, Recursos Humanos, Licitações e Contratos — incluindo disponibilidade, atualidade, série histórica, download aberto e filtro de pesquisa.</w:t>
+        <w:t>O Programa Nacional de Transparência Pública (Atricon) avalia o portal por uma matriz de critérios ponderados. A plataforma atende a 100% dos critérios aplicáveis — nível máximo, o Selo Diamante — pontuando nos itens de maior peso (Receita, Despesa, Recursos Humanos, Licitações e Contratos) em disponibilidade, atualidade, série histórica, download em formato aberto e filtro de pesquisa.</w:t>
+      </w:r>
+    </w:p>
+    <w:p>
+      <w:pPr>
+        <w:spacing w:after="160"/>
+      </w:pPr>
+      <w:r>
+        <w:rPr>
+          <w:b/>
+          <w:i w:val="0"/>
+          <w:color w:val="168821"/>
+          <w:sz w:val="21"/>
+        </w:rPr>
+        <w:t>Sua prefeitura entra no ar já alinhada à nota máxima da transparência pública.</w:t>
       </w:r>
     </w:p>
     <w:p>
@@ -2208,7 +2222,7 @@
                 <w:color w:val="FFCD07"/>
                 <w:sz w:val="20"/>
               </w:rPr>
-              <w:t>Lidera Tecnologia e Gestão   ·   lideraabrange@gmail.com   ·   www.lideratecnologia.com.br</w:t>
+              <w:t>Lidera Tecnologia e Gestão   ·   comercial@lideratecnologia.com.br   ·   www.lideratecnologia.com.br</w:t>
             </w:r>
           </w:p>
         </w:tc>

</xml_diff>

<commit_message>
docs+chore: ADRs, manuais, portfolio e templates de ambiente
- docs: ADR-0005 (gestão de usuários/controle de acesso), ADR-0006 (build do app
  por entidade), manual do sistema, manuais de atendimento/canais e campanhas,
  banco de dados.
- portfolio: apresentação/portfólio e assets atualizados (propostas por cliente
  ficam fora — gitignored).
- .env.example / .env.prod.example: novas chaves (IA web search, WhatsApp Meta,
  campanhas, etc.) — apenas placeholders.

Co-Authored-By: Claude Opus 4.8 (1M context) <noreply@anthropic.com>
</commit_message>
<xml_diff>
--- a/portfolio/Portfolio-Portal-Prefeitura.docx
+++ b/portfolio/Portfolio-Portal-Prefeitura.docx
@@ -563,7 +563,7 @@
               <w:rPr>
                 <w:sz w:val="19"/>
               </w:rPr>
-              <w:t>Ouvidoria + e-SIC (LAI e Lei 13.460) com máquina de estados, prazos/SLA, chat de tramitação e painel do ouvidor</w:t>
+              <w:t>Ouvidoria + e-SIC (LAI e Lei 13.460) com máquina de estados, prazos/SLA, chat de tramitação e painel do ouvidor — sigilo da fonte garantido por duas camadas de controle</w:t>
             </w:r>
           </w:p>
           <w:p>
@@ -574,7 +574,7 @@
               <w:rPr>
                 <w:sz w:val="19"/>
               </w:rPr>
-              <w:t>Atendimento omnichannel: widget 24h + bot de IA que escala para atendente + WhatsApp + caixa unificada</w:t>
+              <w:t>Atendimento omnichannel: bot 24h que EXECUTA ações (abre manifestação com protocolo, consulta andamento, chama atendente) + WhatsApp multi-provedor com redundância + caixa unificada</w:t>
             </w:r>
           </w:p>
           <w:p>
@@ -585,7 +585,7 @@
               <w:rPr>
                 <w:sz w:val="19"/>
               </w:rPr>
-              <w:t>Enquetes (consulta pública anônima) e Construtor de formulários (drag-drop, captcha, exportação CSV/XML/Excel)</w:t>
+              <w:t>Enquetes (consulta pública anônima) e Construtor de formulários (drag-drop, captcha anti-robô Cloudflare Turnstile, exportação CSV/XML/Excel)</w:t>
             </w:r>
           </w:p>
           <w:p>
@@ -597,6 +597,17 @@
                 <w:sz w:val="19"/>
               </w:rPr>
               <w:t>App do Cidadão: chamados georreferenciados (buracos, terrenos, animais) com foto e GPS</w:t>
+            </w:r>
+          </w:p>
+          <w:p>
+            <w:pPr>
+              <w:pStyle w:val="ListBullet"/>
+            </w:pPr>
+            <w:r>
+              <w:rPr>
+                <w:sz w:val="19"/>
+              </w:rPr>
+              <w:t>Comentários em notícias com moderação automática por IA (barra ofensas e código malicioso, preserva crítica legítima)</w:t>
             </w:r>
           </w:p>
         </w:tc>
@@ -947,7 +958,7 @@
               <w:rPr>
                 <w:sz w:val="19"/>
               </w:rPr>
-              <w:t>Chatbot com RAG em camadas sobre a base oficial da prefeitura (busca semântica, isolado por município)</w:t>
+              <w:t>Chatbot com busca híbrida (FTS + semântica/embeddings + reranking Voyage): responde a partir da base oficial combinando palavra e significado, lê PDFs digitalizados via OCR — isolado por município</w:t>
             </w:r>
           </w:p>
           <w:p>
@@ -958,7 +969,7 @@
               <w:rPr>
                 <w:sz w:val="19"/>
               </w:rPr>
-              <w:t>Triagem automática de manifestações, com revisão humana</w:t>
+              <w:t>Base de conhecimento treinável pelo gestor: além de FAQs, o servidor cadastra Artigos livres (normas, eventos, materiais educativos) que a IA passa a usar — sem programação</w:t>
             </w:r>
           </w:p>
           <w:p>
@@ -969,7 +980,7 @@
               <w:rPr>
                 <w:sz w:val="19"/>
               </w:rPr>
-              <w:t>Busca unificada com OCR de PDFs (Tesseract/Claude) e ranking híbrido</w:t>
+              <w:t>Bot agêntico na ouvidoria: executa por linguagem natural (abre manifestação e devolve protocolo, consulta andamento, chama atendente humano)</w:t>
             </w:r>
           </w:p>
           <w:p>
@@ -980,7 +991,18 @@
               <w:rPr>
                 <w:sz w:val="19"/>
               </w:rPr>
-              <w:t>IA fiscal sobre os dados da transparência</w:t>
+              <w:t>Assistente interno que ensina servidores a usar o sistema + Manual do Sistema integrado ao painel</w:t>
+            </w:r>
+          </w:p>
+          <w:p>
+            <w:pPr>
+              <w:pStyle w:val="ListBullet"/>
+            </w:pPr>
+            <w:r>
+              <w:rPr>
+                <w:sz w:val="19"/>
+              </w:rPr>
+              <w:t>Triagem automática de manifestações (sempre com revisão humana) e IA fiscal sobre a transparência</w:t>
             </w:r>
           </w:p>
         </w:tc>
@@ -1043,7 +1065,7 @@
               <w:rPr>
                 <w:sz w:val="19"/>
               </w:rPr>
-              <w:t>LGPD self-service: direitos do titular, portabilidade, anonimização, incidentes e geração de documentos</w:t>
+              <w:t>LGPD self-service: direitos do titular, portabilidade, anonimização, incidentes e geração de documentos (prefeitura = controladora / Lidera = operadora)</w:t>
             </w:r>
           </w:p>
           <w:p>
@@ -1054,7 +1076,7 @@
               <w:rPr>
                 <w:sz w:val="19"/>
               </w:rPr>
-              <w:t>Isolamento multi-tenant por RLS e controle de acesso por papéis (RBAC)</w:t>
+              <w:t>Sigilo multicamadas (RBAC + RLS por papel): denúncias da ouvidoria visíveis só ao ouvidor e equipe — nem o administrador da prefeitura acessa</w:t>
             </w:r>
           </w:p>
           <w:p>
@@ -1065,7 +1087,7 @@
               <w:rPr>
                 <w:sz w:val="19"/>
               </w:rPr>
-              <w:t>Acessibilidade WCAG 2.1 AA / eMAG + VLibras + Design System gov.br</w:t>
+              <w:t>Autocadastro de usuário + solicitação de elevação por cargo/lotação; papéis sensíveis (ouvidor) aprovados pela operadora; termo de sigilo no primeiro acesso</w:t>
             </w:r>
           </w:p>
           <w:p>
@@ -1076,7 +1098,18 @@
               <w:rPr>
                 <w:sz w:val="19"/>
               </w:rPr>
-              <w:t>Login do cidadão via gov.br (Login Único / OIDC)</w:t>
+              <w:t>Escopo por secretaria: servidor lotado numa área só edita o conteúdo da sua secretaria</w:t>
+            </w:r>
+          </w:p>
+          <w:p>
+            <w:pPr>
+              <w:pStyle w:val="ListBullet"/>
+            </w:pPr>
+            <w:r>
+              <w:rPr>
+                <w:sz w:val="19"/>
+              </w:rPr>
+              <w:t>Proteção anti-robô Cloudflare Turnstile em logins e formulários + RBAC + RLS + WCAG 2.1 AA / eMAG + VLibras</w:t>
             </w:r>
           </w:p>
         </w:tc>
@@ -1558,6 +1591,50 @@
         <w:rPr>
           <w:sz w:val="21"/>
         </w:rPr>
+        <w:t>Sigilo jurídico da ouvidoria: denúncias acessíveis SOMENTE ao ouvidor e sua equipe — RBAC + RLS por papel; o administrador da prefeitura não tem acesso.</w:t>
+      </w:r>
+    </w:p>
+    <w:p>
+      <w:pPr>
+        <w:pStyle w:val="ListBullet"/>
+      </w:pPr>
+      <w:r>
+        <w:rPr>
+          <w:sz w:val="21"/>
+        </w:rPr>
+        <w:t>Autocadastro + elevação de papel por autoridade: servidores declaram cargo e lotação; papéis sensíveis (ouvidor) exigem aprovação da operadora e termo de sigilo.</w:t>
+      </w:r>
+    </w:p>
+    <w:p>
+      <w:pPr>
+        <w:pStyle w:val="ListBullet"/>
+      </w:pPr>
+      <w:r>
+        <w:rPr>
+          <w:sz w:val="21"/>
+        </w:rPr>
+        <w:t>Escopo por secretaria: cada servidor gerencia apenas o conteúdo da sua área.</w:t>
+      </w:r>
+    </w:p>
+    <w:p>
+      <w:pPr>
+        <w:pStyle w:val="ListBullet"/>
+      </w:pPr>
+      <w:r>
+        <w:rPr>
+          <w:sz w:val="21"/>
+        </w:rPr>
+        <w:t>Proteção anti-robô Cloudflare Turnstile em logins e formulários — sem CAPTCHA tradicional.</w:t>
+      </w:r>
+    </w:p>
+    <w:p>
+      <w:pPr>
+        <w:pStyle w:val="ListBullet"/>
+      </w:pPr>
+      <w:r>
+        <w:rPr>
+          <w:sz w:val="21"/>
+        </w:rPr>
         <w:t>LGPD por projeto: minimização de dados, base legal por finalidade e logs de acesso a dados pessoais.</w:t>
       </w:r>
     </w:p>
@@ -1627,13 +1704,70 @@
     </w:p>
     <w:p>
       <w:pPr>
+        <w:spacing w:after="120"/>
+      </w:pPr>
+      <w:r>
+        <w:rPr>
+          <w:b w:val="0"/>
+          <w:i w:val="0"/>
+          <w:sz w:val="21"/>
+        </w:rPr>
+        <w:t>A IA não é um chatbot genérico colado ao portal: está integrada ao núcleo, treinada com os dados reais da prefeitura e isolada por município. O gestor treina sem programação; o cidadão recebe respostas da base oficial.</w:t>
+      </w:r>
+    </w:p>
+    <w:p>
+      <w:pPr>
         <w:pStyle w:val="ListBullet"/>
       </w:pPr>
       <w:r>
         <w:rPr>
           <w:sz w:val="21"/>
         </w:rPr>
-        <w:t>Chatbot que responde a partir da base oficial da prefeitura (RAG), sem inventar — e isolado por município.</w:t>
+        <w:t>Chatbot com busca híbrida avançada (FTS + semântica/embeddings com reranking Voyage): responde combinando busca por palavra e por significado — incluindo conteúdo de PDFs digitalizados via OCR (documentos antigos escaneados incluídos).</w:t>
+      </w:r>
+    </w:p>
+    <w:p>
+      <w:pPr>
+        <w:pStyle w:val="ListBullet"/>
+      </w:pPr>
+      <w:r>
+        <w:rPr>
+          <w:sz w:val="21"/>
+        </w:rPr>
+        <w:t>Base de conhecimento treinável pelo gestor: além de FAQs, cadastre Artigos livres (normas de saúde, regimentos, materiais para alunos, eventos) e a IA começa a responder sobre o tema — sem programação.</w:t>
+      </w:r>
+    </w:p>
+    <w:p>
+      <w:pPr>
+        <w:pStyle w:val="ListBullet"/>
+      </w:pPr>
+      <w:r>
+        <w:rPr>
+          <w:sz w:val="21"/>
+        </w:rPr>
+        <w:t>Bot agêntico no atendimento: além de responder, o bot EXECUTA por linguagem natural — abre manifestação de ouvidoria com protocolo+chave, consulta andamento e transfere para atendente humano.</w:t>
+      </w:r>
+    </w:p>
+    <w:p>
+      <w:pPr>
+        <w:pStyle w:val="ListBullet"/>
+      </w:pPr>
+      <w:r>
+        <w:rPr>
+          <w:sz w:val="21"/>
+        </w:rPr>
+        <w:t>Assistente interno ("Como faço X?") que ensina os próprios servidores a usar o sistema, com Manual do Sistema integrado ao painel administrativo.</w:t>
+      </w:r>
+    </w:p>
+    <w:p>
+      <w:pPr>
+        <w:pStyle w:val="ListBullet"/>
+      </w:pPr>
+      <w:r>
+        <w:rPr>
+          <w:sz w:val="21"/>
+        </w:rPr>
+        <w:t>Moderação inteligente de comentários em notícias: a IA barra ofensas, baixo calão e código malicioso sem censurar crítica ou opinião legítima — o que passa vai para aprovação humana.</w:t>
       </w:r>
     </w:p>
     <w:p>
@@ -1655,18 +1789,7 @@
         <w:rPr>
           <w:sz w:val="21"/>
         </w:rPr>
-        <w:t>Busca unificada que enxerga dentro de PDFs digitalizados (OCR) com ranking híbrido.</w:t>
-      </w:r>
-    </w:p>
-    <w:p>
-      <w:pPr>
-        <w:pStyle w:val="ListBullet"/>
-      </w:pPr>
-      <w:r>
-        <w:rPr>
-          <w:sz w:val="21"/>
-        </w:rPr>
-        <w:t>IA fiscal sobre a transparência, com consulta estruturada aos dados contábeis.</w:t>
+        <w:t>IA fiscal sobre a transparência, com consulta estruturada aos dados contábeis do APLIC/TCE-MT.</w:t>
       </w:r>
     </w:p>
     <w:p/>
@@ -2055,7 +2178,7 @@
           <w:i w:val="0"/>
           <w:sz w:val="21"/>
         </w:rPr>
-        <w:t>O produto evolui em fases com critérios de saída objetivos. A fundação está concluída e em produção; as próximas fases ampliam transparência, serviços, app e IA.</w:t>
+        <w:t>O produto evolui em fases com critérios de saída objetivos. As fases de Fundação, Transparência, Serviços+CMS, Diário Oficial e Inteligência Artificial estão concluídas e em produção. As próximas fases ampliam o App do Cidadão e a escala multi-região.</w:t>
       </w:r>
     </w:p>
     <w:p>

</xml_diff>